<commit_message>
beispiellisten links fuer beispielliste rmd files
</commit_message>
<xml_diff>
--- a/beispielliste.docx
+++ b/beispielliste.docx
@@ -5,7 +5,6 @@
     <w:p>
       <w:pPr>
         <w:pStyle w:val="Title"/>
-        <w:jc w:val="left"/>
         <w:rPr>
           <w:lang w:val="de-DE"/>
         </w:rPr>
@@ -62,17 +61,17 @@
     </w:p>
     <w:tbl>
       <w:tblPr>
-        <w:tblStyle w:val="GridTable3-Accent4"/>
+        <w:tblStyle w:val="GridTable4-Accent1"/>
         <w:tblW w:w="5000" w:type="pct"/>
         <w:tblLayout w:type="fixed"/>
         <w:tblLook w:val="0420" w:firstRow="1" w:lastRow="0" w:firstColumn="0" w:lastColumn="0" w:noHBand="0" w:noVBand="1"/>
       </w:tblPr>
       <w:tblGrid>
-        <w:gridCol w:w="1173"/>
-        <w:gridCol w:w="5864"/>
-        <w:gridCol w:w="781"/>
-        <w:gridCol w:w="781"/>
-        <w:gridCol w:w="977"/>
+        <w:gridCol w:w="1149"/>
+        <w:gridCol w:w="5746"/>
+        <w:gridCol w:w="958"/>
+        <w:gridCol w:w="765"/>
+        <w:gridCol w:w="958"/>
       </w:tblGrid>
       <w:tr>
         <w:trPr>
@@ -80,20 +79,22 @@
         </w:trPr>
         <w:tc>
           <w:tcPr>
-            <w:tcW w:w="969" w:type="dxa"/>
-          </w:tcPr>
-          <w:p>
-            <w:pPr>
-              <w:pStyle w:val="Compact"/>
-            </w:pPr>
+            <w:tcW w:w="950" w:type="dxa"/>
+          </w:tcPr>
+          <w:p>
+            <w:pPr>
+              <w:pStyle w:val="Compact"/>
+            </w:pPr>
+            <w:proofErr w:type="spellStart"/>
             <w:r>
               <w:t>bsp</w:t>
             </w:r>
-          </w:p>
-        </w:tc>
-        <w:tc>
-          <w:tcPr>
-            <w:tcW w:w="4848" w:type="dxa"/>
+            <w:proofErr w:type="spellEnd"/>
+          </w:p>
+        </w:tc>
+        <w:tc>
+          <w:tcPr>
+            <w:tcW w:w="4752" w:type="dxa"/>
           </w:tcPr>
           <w:p>
             <w:pPr>
@@ -106,7 +107,7 @@
         </w:tc>
         <w:tc>
           <w:tcPr>
-            <w:tcW w:w="646" w:type="dxa"/>
+            <w:tcW w:w="792" w:type="dxa"/>
           </w:tcPr>
           <w:p>
             <w:pPr>
@@ -119,7 +120,7 @@
         </w:tc>
         <w:tc>
           <w:tcPr>
-            <w:tcW w:w="646" w:type="dxa"/>
+            <w:tcW w:w="633" w:type="dxa"/>
           </w:tcPr>
           <w:p>
             <w:pPr>
@@ -132,7 +133,7 @@
         </w:tc>
         <w:tc>
           <w:tcPr>
-            <w:tcW w:w="808" w:type="dxa"/>
+            <w:tcW w:w="792" w:type="dxa"/>
           </w:tcPr>
           <w:p>
             <w:pPr>
@@ -150,7 +151,7 @@
         </w:trPr>
         <w:tc>
           <w:tcPr>
-            <w:tcW w:w="969" w:type="dxa"/>
+            <w:tcW w:w="950" w:type="dxa"/>
           </w:tcPr>
           <w:p>
             <w:pPr>
@@ -163,7 +164,7 @@
         </w:tc>
         <w:tc>
           <w:tcPr>
-            <w:tcW w:w="4848" w:type="dxa"/>
+            <w:tcW w:w="4752" w:type="dxa"/>
           </w:tcPr>
           <w:p>
             <w:pPr>
@@ -176,33 +177,33 @@
         </w:tc>
         <w:tc>
           <w:tcPr>
-            <w:tcW w:w="646" w:type="dxa"/>
-          </w:tcPr>
-          <w:p>
-            <w:pPr>
-              <w:pStyle w:val="Compact"/>
-            </w:pPr>
-            <w:r>
-              <w:t>Yes</w:t>
-            </w:r>
-          </w:p>
-        </w:tc>
-        <w:tc>
-          <w:tcPr>
-            <w:tcW w:w="646" w:type="dxa"/>
-          </w:tcPr>
-          <w:p>
-            <w:pPr>
-              <w:pStyle w:val="Compact"/>
-            </w:pPr>
-            <w:r>
-              <w:t>Yes</w:t>
-            </w:r>
-          </w:p>
-        </w:tc>
-        <w:tc>
-          <w:tcPr>
-            <w:tcW w:w="808" w:type="dxa"/>
+            <w:tcW w:w="792" w:type="dxa"/>
+          </w:tcPr>
+          <w:p>
+            <w:pPr>
+              <w:pStyle w:val="Compact"/>
+            </w:pPr>
+            <w:r>
+              <w:t>Ja</w:t>
+            </w:r>
+          </w:p>
+        </w:tc>
+        <w:tc>
+          <w:tcPr>
+            <w:tcW w:w="633" w:type="dxa"/>
+          </w:tcPr>
+          <w:p>
+            <w:pPr>
+              <w:pStyle w:val="Compact"/>
+            </w:pPr>
+            <w:r>
+              <w:t>Ja</w:t>
+            </w:r>
+          </w:p>
+        </w:tc>
+        <w:tc>
+          <w:tcPr>
+            <w:tcW w:w="792" w:type="dxa"/>
           </w:tcPr>
           <w:p>
             <w:pPr>
@@ -222,7 +223,7 @@
       <w:tr>
         <w:tc>
           <w:tcPr>
-            <w:tcW w:w="969" w:type="dxa"/>
+            <w:tcW w:w="950" w:type="dxa"/>
           </w:tcPr>
           <w:p>
             <w:pPr>
@@ -235,7 +236,7 @@
         </w:tc>
         <w:tc>
           <w:tcPr>
-            <w:tcW w:w="4848" w:type="dxa"/>
+            <w:tcW w:w="4752" w:type="dxa"/>
           </w:tcPr>
           <w:p>
             <w:pPr>
@@ -248,33 +249,33 @@
         </w:tc>
         <w:tc>
           <w:tcPr>
-            <w:tcW w:w="646" w:type="dxa"/>
-          </w:tcPr>
-          <w:p>
-            <w:pPr>
-              <w:pStyle w:val="Compact"/>
-            </w:pPr>
-            <w:r>
-              <w:t>Yes</w:t>
-            </w:r>
-          </w:p>
-        </w:tc>
-        <w:tc>
-          <w:tcPr>
-            <w:tcW w:w="646" w:type="dxa"/>
-          </w:tcPr>
-          <w:p>
-            <w:pPr>
-              <w:pStyle w:val="Compact"/>
-            </w:pPr>
-            <w:r>
-              <w:t>Yes</w:t>
-            </w:r>
-          </w:p>
-        </w:tc>
-        <w:tc>
-          <w:tcPr>
-            <w:tcW w:w="808" w:type="dxa"/>
+            <w:tcW w:w="792" w:type="dxa"/>
+          </w:tcPr>
+          <w:p>
+            <w:pPr>
+              <w:pStyle w:val="Compact"/>
+            </w:pPr>
+            <w:r>
+              <w:t>Ja</w:t>
+            </w:r>
+          </w:p>
+        </w:tc>
+        <w:tc>
+          <w:tcPr>
+            <w:tcW w:w="633" w:type="dxa"/>
+          </w:tcPr>
+          <w:p>
+            <w:pPr>
+              <w:pStyle w:val="Compact"/>
+            </w:pPr>
+            <w:r>
+              <w:t>Ja</w:t>
+            </w:r>
+          </w:p>
+        </w:tc>
+        <w:tc>
+          <w:tcPr>
+            <w:tcW w:w="792" w:type="dxa"/>
           </w:tcPr>
           <w:p>
             <w:pPr>
@@ -297,7 +298,7 @@
         </w:trPr>
         <w:tc>
           <w:tcPr>
-            <w:tcW w:w="969" w:type="dxa"/>
+            <w:tcW w:w="950" w:type="dxa"/>
           </w:tcPr>
           <w:p>
             <w:pPr>
@@ -310,7 +311,7 @@
         </w:tc>
         <w:tc>
           <w:tcPr>
-            <w:tcW w:w="4848" w:type="dxa"/>
+            <w:tcW w:w="4752" w:type="dxa"/>
           </w:tcPr>
           <w:p>
             <w:pPr>
@@ -323,33 +324,33 @@
         </w:tc>
         <w:tc>
           <w:tcPr>
-            <w:tcW w:w="646" w:type="dxa"/>
-          </w:tcPr>
-          <w:p>
-            <w:pPr>
-              <w:pStyle w:val="Compact"/>
-            </w:pPr>
-            <w:r>
-              <w:t>Yes</w:t>
-            </w:r>
-          </w:p>
-        </w:tc>
-        <w:tc>
-          <w:tcPr>
-            <w:tcW w:w="646" w:type="dxa"/>
-          </w:tcPr>
-          <w:p>
-            <w:pPr>
-              <w:pStyle w:val="Compact"/>
-            </w:pPr>
-            <w:r>
-              <w:t>Yes</w:t>
-            </w:r>
-          </w:p>
-        </w:tc>
-        <w:tc>
-          <w:tcPr>
-            <w:tcW w:w="808" w:type="dxa"/>
+            <w:tcW w:w="792" w:type="dxa"/>
+          </w:tcPr>
+          <w:p>
+            <w:pPr>
+              <w:pStyle w:val="Compact"/>
+            </w:pPr>
+            <w:r>
+              <w:t>Ja</w:t>
+            </w:r>
+          </w:p>
+        </w:tc>
+        <w:tc>
+          <w:tcPr>
+            <w:tcW w:w="633" w:type="dxa"/>
+          </w:tcPr>
+          <w:p>
+            <w:pPr>
+              <w:pStyle w:val="Compact"/>
+            </w:pPr>
+            <w:r>
+              <w:t>Ja</w:t>
+            </w:r>
+          </w:p>
+        </w:tc>
+        <w:tc>
+          <w:tcPr>
+            <w:tcW w:w="792" w:type="dxa"/>
           </w:tcPr>
           <w:p>
             <w:pPr>
@@ -369,7 +370,7 @@
       <w:tr>
         <w:tc>
           <w:tcPr>
-            <w:tcW w:w="969" w:type="dxa"/>
+            <w:tcW w:w="950" w:type="dxa"/>
           </w:tcPr>
           <w:p>
             <w:pPr>
@@ -382,7 +383,7 @@
         </w:tc>
         <w:tc>
           <w:tcPr>
-            <w:tcW w:w="4848" w:type="dxa"/>
+            <w:tcW w:w="4752" w:type="dxa"/>
           </w:tcPr>
           <w:p>
             <w:pPr>
@@ -395,33 +396,33 @@
         </w:tc>
         <w:tc>
           <w:tcPr>
-            <w:tcW w:w="646" w:type="dxa"/>
-          </w:tcPr>
-          <w:p>
-            <w:pPr>
-              <w:pStyle w:val="Compact"/>
-            </w:pPr>
-            <w:r>
-              <w:t>Yes</w:t>
-            </w:r>
-          </w:p>
-        </w:tc>
-        <w:tc>
-          <w:tcPr>
-            <w:tcW w:w="646" w:type="dxa"/>
-          </w:tcPr>
-          <w:p>
-            <w:pPr>
-              <w:pStyle w:val="Compact"/>
-            </w:pPr>
-            <w:r>
-              <w:t>Yes</w:t>
-            </w:r>
-          </w:p>
-        </w:tc>
-        <w:tc>
-          <w:tcPr>
-            <w:tcW w:w="808" w:type="dxa"/>
+            <w:tcW w:w="792" w:type="dxa"/>
+          </w:tcPr>
+          <w:p>
+            <w:pPr>
+              <w:pStyle w:val="Compact"/>
+            </w:pPr>
+            <w:r>
+              <w:t>Ja</w:t>
+            </w:r>
+          </w:p>
+        </w:tc>
+        <w:tc>
+          <w:tcPr>
+            <w:tcW w:w="633" w:type="dxa"/>
+          </w:tcPr>
+          <w:p>
+            <w:pPr>
+              <w:pStyle w:val="Compact"/>
+            </w:pPr>
+            <w:r>
+              <w:t>Ja</w:t>
+            </w:r>
+          </w:p>
+        </w:tc>
+        <w:tc>
+          <w:tcPr>
+            <w:tcW w:w="792" w:type="dxa"/>
           </w:tcPr>
           <w:p>
             <w:pPr>
@@ -444,7 +445,7 @@
         </w:trPr>
         <w:tc>
           <w:tcPr>
-            <w:tcW w:w="969" w:type="dxa"/>
+            <w:tcW w:w="950" w:type="dxa"/>
           </w:tcPr>
           <w:p>
             <w:pPr>
@@ -457,7 +458,7 @@
         </w:tc>
         <w:tc>
           <w:tcPr>
-            <w:tcW w:w="4848" w:type="dxa"/>
+            <w:tcW w:w="4752" w:type="dxa"/>
           </w:tcPr>
           <w:p>
             <w:pPr>
@@ -470,33 +471,33 @@
         </w:tc>
         <w:tc>
           <w:tcPr>
-            <w:tcW w:w="646" w:type="dxa"/>
-          </w:tcPr>
-          <w:p>
-            <w:pPr>
-              <w:pStyle w:val="Compact"/>
-            </w:pPr>
-            <w:r>
-              <w:t>Yes</w:t>
-            </w:r>
-          </w:p>
-        </w:tc>
-        <w:tc>
-          <w:tcPr>
-            <w:tcW w:w="646" w:type="dxa"/>
-          </w:tcPr>
-          <w:p>
-            <w:pPr>
-              <w:pStyle w:val="Compact"/>
-            </w:pPr>
-            <w:r>
-              <w:t>Yes</w:t>
-            </w:r>
-          </w:p>
-        </w:tc>
-        <w:tc>
-          <w:tcPr>
-            <w:tcW w:w="808" w:type="dxa"/>
+            <w:tcW w:w="792" w:type="dxa"/>
+          </w:tcPr>
+          <w:p>
+            <w:pPr>
+              <w:pStyle w:val="Compact"/>
+            </w:pPr>
+            <w:r>
+              <w:t>Ja</w:t>
+            </w:r>
+          </w:p>
+        </w:tc>
+        <w:tc>
+          <w:tcPr>
+            <w:tcW w:w="633" w:type="dxa"/>
+          </w:tcPr>
+          <w:p>
+            <w:pPr>
+              <w:pStyle w:val="Compact"/>
+            </w:pPr>
+            <w:r>
+              <w:t>Ja</w:t>
+            </w:r>
+          </w:p>
+        </w:tc>
+        <w:tc>
+          <w:tcPr>
+            <w:tcW w:w="792" w:type="dxa"/>
           </w:tcPr>
           <w:p>
             <w:pPr>
@@ -516,7 +517,7 @@
       <w:tr>
         <w:tc>
           <w:tcPr>
-            <w:tcW w:w="969" w:type="dxa"/>
+            <w:tcW w:w="950" w:type="dxa"/>
           </w:tcPr>
           <w:p>
             <w:pPr>
@@ -529,7 +530,7 @@
         </w:tc>
         <w:tc>
           <w:tcPr>
-            <w:tcW w:w="4848" w:type="dxa"/>
+            <w:tcW w:w="4752" w:type="dxa"/>
           </w:tcPr>
           <w:p>
             <w:pPr>
@@ -542,33 +543,33 @@
         </w:tc>
         <w:tc>
           <w:tcPr>
-            <w:tcW w:w="646" w:type="dxa"/>
-          </w:tcPr>
-          <w:p>
-            <w:pPr>
-              <w:pStyle w:val="Compact"/>
-            </w:pPr>
-            <w:r>
-              <w:t>Yes</w:t>
-            </w:r>
-          </w:p>
-        </w:tc>
-        <w:tc>
-          <w:tcPr>
-            <w:tcW w:w="646" w:type="dxa"/>
-          </w:tcPr>
-          <w:p>
-            <w:pPr>
-              <w:pStyle w:val="Compact"/>
-            </w:pPr>
-            <w:r>
-              <w:t>Yes</w:t>
-            </w:r>
-          </w:p>
-        </w:tc>
-        <w:tc>
-          <w:tcPr>
-            <w:tcW w:w="808" w:type="dxa"/>
+            <w:tcW w:w="792" w:type="dxa"/>
+          </w:tcPr>
+          <w:p>
+            <w:pPr>
+              <w:pStyle w:val="Compact"/>
+            </w:pPr>
+            <w:r>
+              <w:t>Ja</w:t>
+            </w:r>
+          </w:p>
+        </w:tc>
+        <w:tc>
+          <w:tcPr>
+            <w:tcW w:w="633" w:type="dxa"/>
+          </w:tcPr>
+          <w:p>
+            <w:pPr>
+              <w:pStyle w:val="Compact"/>
+            </w:pPr>
+            <w:r>
+              <w:t>Ja</w:t>
+            </w:r>
+          </w:p>
+        </w:tc>
+        <w:tc>
+          <w:tcPr>
+            <w:tcW w:w="792" w:type="dxa"/>
           </w:tcPr>
           <w:p>
             <w:pPr>
@@ -591,7 +592,7 @@
         </w:trPr>
         <w:tc>
           <w:tcPr>
-            <w:tcW w:w="969" w:type="dxa"/>
+            <w:tcW w:w="950" w:type="dxa"/>
           </w:tcPr>
           <w:p>
             <w:pPr>
@@ -604,7 +605,7 @@
         </w:tc>
         <w:tc>
           <w:tcPr>
-            <w:tcW w:w="4848" w:type="dxa"/>
+            <w:tcW w:w="4752" w:type="dxa"/>
           </w:tcPr>
           <w:p>
             <w:pPr>
@@ -617,33 +618,33 @@
         </w:tc>
         <w:tc>
           <w:tcPr>
-            <w:tcW w:w="646" w:type="dxa"/>
-          </w:tcPr>
-          <w:p>
-            <w:pPr>
-              <w:pStyle w:val="Compact"/>
-            </w:pPr>
-            <w:r>
-              <w:t>Yes</w:t>
-            </w:r>
-          </w:p>
-        </w:tc>
-        <w:tc>
-          <w:tcPr>
-            <w:tcW w:w="646" w:type="dxa"/>
-          </w:tcPr>
-          <w:p>
-            <w:pPr>
-              <w:pStyle w:val="Compact"/>
-            </w:pPr>
-            <w:r>
-              <w:t>Yes</w:t>
-            </w:r>
-          </w:p>
-        </w:tc>
-        <w:tc>
-          <w:tcPr>
-            <w:tcW w:w="808" w:type="dxa"/>
+            <w:tcW w:w="792" w:type="dxa"/>
+          </w:tcPr>
+          <w:p>
+            <w:pPr>
+              <w:pStyle w:val="Compact"/>
+            </w:pPr>
+            <w:r>
+              <w:t>Ja</w:t>
+            </w:r>
+          </w:p>
+        </w:tc>
+        <w:tc>
+          <w:tcPr>
+            <w:tcW w:w="633" w:type="dxa"/>
+          </w:tcPr>
+          <w:p>
+            <w:pPr>
+              <w:pStyle w:val="Compact"/>
+            </w:pPr>
+            <w:r>
+              <w:t>Ja</w:t>
+            </w:r>
+          </w:p>
+        </w:tc>
+        <w:tc>
+          <w:tcPr>
+            <w:tcW w:w="792" w:type="dxa"/>
           </w:tcPr>
           <w:p>
             <w:pPr>
@@ -663,7 +664,7 @@
       <w:tr>
         <w:tc>
           <w:tcPr>
-            <w:tcW w:w="969" w:type="dxa"/>
+            <w:tcW w:w="950" w:type="dxa"/>
           </w:tcPr>
           <w:p>
             <w:pPr>
@@ -676,7 +677,7 @@
         </w:tc>
         <w:tc>
           <w:tcPr>
-            <w:tcW w:w="4848" w:type="dxa"/>
+            <w:tcW w:w="4752" w:type="dxa"/>
           </w:tcPr>
           <w:p>
             <w:pPr>
@@ -689,33 +690,33 @@
         </w:tc>
         <w:tc>
           <w:tcPr>
-            <w:tcW w:w="646" w:type="dxa"/>
-          </w:tcPr>
-          <w:p>
-            <w:pPr>
-              <w:pStyle w:val="Compact"/>
-            </w:pPr>
-            <w:r>
-              <w:t>Yes</w:t>
-            </w:r>
-          </w:p>
-        </w:tc>
-        <w:tc>
-          <w:tcPr>
-            <w:tcW w:w="646" w:type="dxa"/>
-          </w:tcPr>
-          <w:p>
-            <w:pPr>
-              <w:pStyle w:val="Compact"/>
-            </w:pPr>
-            <w:r>
-              <w:t>Yes</w:t>
-            </w:r>
-          </w:p>
-        </w:tc>
-        <w:tc>
-          <w:tcPr>
-            <w:tcW w:w="808" w:type="dxa"/>
+            <w:tcW w:w="792" w:type="dxa"/>
+          </w:tcPr>
+          <w:p>
+            <w:pPr>
+              <w:pStyle w:val="Compact"/>
+            </w:pPr>
+            <w:r>
+              <w:t>Ja</w:t>
+            </w:r>
+          </w:p>
+        </w:tc>
+        <w:tc>
+          <w:tcPr>
+            <w:tcW w:w="633" w:type="dxa"/>
+          </w:tcPr>
+          <w:p>
+            <w:pPr>
+              <w:pStyle w:val="Compact"/>
+            </w:pPr>
+            <w:r>
+              <w:t>Ja</w:t>
+            </w:r>
+          </w:p>
+        </w:tc>
+        <w:tc>
+          <w:tcPr>
+            <w:tcW w:w="792" w:type="dxa"/>
           </w:tcPr>
           <w:p>
             <w:pPr>
@@ -738,7 +739,7 @@
         </w:trPr>
         <w:tc>
           <w:tcPr>
-            <w:tcW w:w="969" w:type="dxa"/>
+            <w:tcW w:w="950" w:type="dxa"/>
           </w:tcPr>
           <w:p>
             <w:pPr>
@@ -751,7 +752,7 @@
         </w:tc>
         <w:tc>
           <w:tcPr>
-            <w:tcW w:w="4848" w:type="dxa"/>
+            <w:tcW w:w="4752" w:type="dxa"/>
           </w:tcPr>
           <w:p>
             <w:pPr>
@@ -764,33 +765,33 @@
         </w:tc>
         <w:tc>
           <w:tcPr>
-            <w:tcW w:w="646" w:type="dxa"/>
-          </w:tcPr>
-          <w:p>
-            <w:pPr>
-              <w:pStyle w:val="Compact"/>
-            </w:pPr>
-            <w:r>
-              <w:t>Yes</w:t>
-            </w:r>
-          </w:p>
-        </w:tc>
-        <w:tc>
-          <w:tcPr>
-            <w:tcW w:w="646" w:type="dxa"/>
-          </w:tcPr>
-          <w:p>
-            <w:pPr>
-              <w:pStyle w:val="Compact"/>
-            </w:pPr>
-            <w:r>
-              <w:t>Yes</w:t>
-            </w:r>
-          </w:p>
-        </w:tc>
-        <w:tc>
-          <w:tcPr>
-            <w:tcW w:w="808" w:type="dxa"/>
+            <w:tcW w:w="792" w:type="dxa"/>
+          </w:tcPr>
+          <w:p>
+            <w:pPr>
+              <w:pStyle w:val="Compact"/>
+            </w:pPr>
+            <w:r>
+              <w:t>Ja</w:t>
+            </w:r>
+          </w:p>
+        </w:tc>
+        <w:tc>
+          <w:tcPr>
+            <w:tcW w:w="633" w:type="dxa"/>
+          </w:tcPr>
+          <w:p>
+            <w:pPr>
+              <w:pStyle w:val="Compact"/>
+            </w:pPr>
+            <w:r>
+              <w:t>Ja</w:t>
+            </w:r>
+          </w:p>
+        </w:tc>
+        <w:tc>
+          <w:tcPr>
+            <w:tcW w:w="792" w:type="dxa"/>
           </w:tcPr>
           <w:p>
             <w:pPr>
@@ -810,7 +811,7 @@
       <w:tr>
         <w:tc>
           <w:tcPr>
-            <w:tcW w:w="969" w:type="dxa"/>
+            <w:tcW w:w="950" w:type="dxa"/>
           </w:tcPr>
           <w:p>
             <w:pPr>
@@ -823,7 +824,7 @@
         </w:tc>
         <w:tc>
           <w:tcPr>
-            <w:tcW w:w="4848" w:type="dxa"/>
+            <w:tcW w:w="4752" w:type="dxa"/>
           </w:tcPr>
           <w:p>
             <w:pPr>
@@ -836,33 +837,33 @@
         </w:tc>
         <w:tc>
           <w:tcPr>
-            <w:tcW w:w="646" w:type="dxa"/>
-          </w:tcPr>
-          <w:p>
-            <w:pPr>
-              <w:pStyle w:val="Compact"/>
-            </w:pPr>
-            <w:r>
-              <w:t>Yes</w:t>
-            </w:r>
-          </w:p>
-        </w:tc>
-        <w:tc>
-          <w:tcPr>
-            <w:tcW w:w="646" w:type="dxa"/>
-          </w:tcPr>
-          <w:p>
-            <w:pPr>
-              <w:pStyle w:val="Compact"/>
-            </w:pPr>
-            <w:r>
-              <w:t>Yes</w:t>
-            </w:r>
-          </w:p>
-        </w:tc>
-        <w:tc>
-          <w:tcPr>
-            <w:tcW w:w="808" w:type="dxa"/>
+            <w:tcW w:w="792" w:type="dxa"/>
+          </w:tcPr>
+          <w:p>
+            <w:pPr>
+              <w:pStyle w:val="Compact"/>
+            </w:pPr>
+            <w:r>
+              <w:t>Ja</w:t>
+            </w:r>
+          </w:p>
+        </w:tc>
+        <w:tc>
+          <w:tcPr>
+            <w:tcW w:w="633" w:type="dxa"/>
+          </w:tcPr>
+          <w:p>
+            <w:pPr>
+              <w:pStyle w:val="Compact"/>
+            </w:pPr>
+            <w:r>
+              <w:t>Ja</w:t>
+            </w:r>
+          </w:p>
+        </w:tc>
+        <w:tc>
+          <w:tcPr>
+            <w:tcW w:w="792" w:type="dxa"/>
           </w:tcPr>
           <w:p>
             <w:pPr>
@@ -885,7 +886,7 @@
         </w:trPr>
         <w:tc>
           <w:tcPr>
-            <w:tcW w:w="969" w:type="dxa"/>
+            <w:tcW w:w="950" w:type="dxa"/>
           </w:tcPr>
           <w:p>
             <w:pPr>
@@ -898,7 +899,7 @@
         </w:tc>
         <w:tc>
           <w:tcPr>
-            <w:tcW w:w="4848" w:type="dxa"/>
+            <w:tcW w:w="4752" w:type="dxa"/>
           </w:tcPr>
           <w:p>
             <w:pPr>
@@ -911,33 +912,33 @@
         </w:tc>
         <w:tc>
           <w:tcPr>
-            <w:tcW w:w="646" w:type="dxa"/>
-          </w:tcPr>
-          <w:p>
-            <w:pPr>
-              <w:pStyle w:val="Compact"/>
-            </w:pPr>
-            <w:r>
-              <w:t>Yes</w:t>
-            </w:r>
-          </w:p>
-        </w:tc>
-        <w:tc>
-          <w:tcPr>
-            <w:tcW w:w="646" w:type="dxa"/>
-          </w:tcPr>
-          <w:p>
-            <w:pPr>
-              <w:pStyle w:val="Compact"/>
-            </w:pPr>
-            <w:r>
-              <w:t>Yes</w:t>
-            </w:r>
-          </w:p>
-        </w:tc>
-        <w:tc>
-          <w:tcPr>
-            <w:tcW w:w="808" w:type="dxa"/>
+            <w:tcW w:w="792" w:type="dxa"/>
+          </w:tcPr>
+          <w:p>
+            <w:pPr>
+              <w:pStyle w:val="Compact"/>
+            </w:pPr>
+            <w:r>
+              <w:t>Ja</w:t>
+            </w:r>
+          </w:p>
+        </w:tc>
+        <w:tc>
+          <w:tcPr>
+            <w:tcW w:w="633" w:type="dxa"/>
+          </w:tcPr>
+          <w:p>
+            <w:pPr>
+              <w:pStyle w:val="Compact"/>
+            </w:pPr>
+            <w:r>
+              <w:t>Ja</w:t>
+            </w:r>
+          </w:p>
+        </w:tc>
+        <w:tc>
+          <w:tcPr>
+            <w:tcW w:w="792" w:type="dxa"/>
           </w:tcPr>
           <w:p>
             <w:pPr>
@@ -957,7 +958,7 @@
       <w:tr>
         <w:tc>
           <w:tcPr>
-            <w:tcW w:w="969" w:type="dxa"/>
+            <w:tcW w:w="950" w:type="dxa"/>
           </w:tcPr>
           <w:p>
             <w:pPr>
@@ -970,7 +971,7 @@
         </w:tc>
         <w:tc>
           <w:tcPr>
-            <w:tcW w:w="4848" w:type="dxa"/>
+            <w:tcW w:w="4752" w:type="dxa"/>
           </w:tcPr>
           <w:p>
             <w:pPr>
@@ -983,33 +984,33 @@
         </w:tc>
         <w:tc>
           <w:tcPr>
-            <w:tcW w:w="646" w:type="dxa"/>
-          </w:tcPr>
-          <w:p>
-            <w:pPr>
-              <w:pStyle w:val="Compact"/>
-            </w:pPr>
-            <w:r>
-              <w:t>Yes</w:t>
-            </w:r>
-          </w:p>
-        </w:tc>
-        <w:tc>
-          <w:tcPr>
-            <w:tcW w:w="646" w:type="dxa"/>
-          </w:tcPr>
-          <w:p>
-            <w:pPr>
-              <w:pStyle w:val="Compact"/>
-            </w:pPr>
-            <w:r>
-              <w:t>Yes</w:t>
-            </w:r>
-          </w:p>
-        </w:tc>
-        <w:tc>
-          <w:tcPr>
-            <w:tcW w:w="808" w:type="dxa"/>
+            <w:tcW w:w="792" w:type="dxa"/>
+          </w:tcPr>
+          <w:p>
+            <w:pPr>
+              <w:pStyle w:val="Compact"/>
+            </w:pPr>
+            <w:r>
+              <w:t>Ja</w:t>
+            </w:r>
+          </w:p>
+        </w:tc>
+        <w:tc>
+          <w:tcPr>
+            <w:tcW w:w="633" w:type="dxa"/>
+          </w:tcPr>
+          <w:p>
+            <w:pPr>
+              <w:pStyle w:val="Compact"/>
+            </w:pPr>
+            <w:r>
+              <w:t>Ja</w:t>
+            </w:r>
+          </w:p>
+        </w:tc>
+        <w:tc>
+          <w:tcPr>
+            <w:tcW w:w="792" w:type="dxa"/>
           </w:tcPr>
           <w:p>
             <w:pPr>
@@ -1032,7 +1033,7 @@
         </w:trPr>
         <w:tc>
           <w:tcPr>
-            <w:tcW w:w="969" w:type="dxa"/>
+            <w:tcW w:w="950" w:type="dxa"/>
           </w:tcPr>
           <w:p>
             <w:pPr>
@@ -1045,7 +1046,7 @@
         </w:tc>
         <w:tc>
           <w:tcPr>
-            <w:tcW w:w="4848" w:type="dxa"/>
+            <w:tcW w:w="4752" w:type="dxa"/>
           </w:tcPr>
           <w:p>
             <w:pPr>
@@ -1058,33 +1059,33 @@
         </w:tc>
         <w:tc>
           <w:tcPr>
-            <w:tcW w:w="646" w:type="dxa"/>
-          </w:tcPr>
-          <w:p>
-            <w:pPr>
-              <w:pStyle w:val="Compact"/>
-            </w:pPr>
-            <w:r>
-              <w:t>Yes</w:t>
-            </w:r>
-          </w:p>
-        </w:tc>
-        <w:tc>
-          <w:tcPr>
-            <w:tcW w:w="646" w:type="dxa"/>
-          </w:tcPr>
-          <w:p>
-            <w:pPr>
-              <w:pStyle w:val="Compact"/>
-            </w:pPr>
-            <w:r>
-              <w:t>Yes</w:t>
-            </w:r>
-          </w:p>
-        </w:tc>
-        <w:tc>
-          <w:tcPr>
-            <w:tcW w:w="808" w:type="dxa"/>
+            <w:tcW w:w="792" w:type="dxa"/>
+          </w:tcPr>
+          <w:p>
+            <w:pPr>
+              <w:pStyle w:val="Compact"/>
+            </w:pPr>
+            <w:r>
+              <w:t>Ja</w:t>
+            </w:r>
+          </w:p>
+        </w:tc>
+        <w:tc>
+          <w:tcPr>
+            <w:tcW w:w="633" w:type="dxa"/>
+          </w:tcPr>
+          <w:p>
+            <w:pPr>
+              <w:pStyle w:val="Compact"/>
+            </w:pPr>
+            <w:r>
+              <w:t>Ja</w:t>
+            </w:r>
+          </w:p>
+        </w:tc>
+        <w:tc>
+          <w:tcPr>
+            <w:tcW w:w="792" w:type="dxa"/>
           </w:tcPr>
           <w:p>
             <w:pPr>
@@ -1104,7 +1105,7 @@
       <w:tr>
         <w:tc>
           <w:tcPr>
-            <w:tcW w:w="969" w:type="dxa"/>
+            <w:tcW w:w="950" w:type="dxa"/>
           </w:tcPr>
           <w:p>
             <w:pPr>
@@ -1117,7 +1118,7 @@
         </w:tc>
         <w:tc>
           <w:tcPr>
-            <w:tcW w:w="4848" w:type="dxa"/>
+            <w:tcW w:w="4752" w:type="dxa"/>
           </w:tcPr>
           <w:p>
             <w:pPr>
@@ -1130,33 +1131,33 @@
         </w:tc>
         <w:tc>
           <w:tcPr>
-            <w:tcW w:w="646" w:type="dxa"/>
-          </w:tcPr>
-          <w:p>
-            <w:pPr>
-              <w:pStyle w:val="Compact"/>
-            </w:pPr>
-            <w:r>
-              <w:t>Yes</w:t>
-            </w:r>
-          </w:p>
-        </w:tc>
-        <w:tc>
-          <w:tcPr>
-            <w:tcW w:w="646" w:type="dxa"/>
-          </w:tcPr>
-          <w:p>
-            <w:pPr>
-              <w:pStyle w:val="Compact"/>
-            </w:pPr>
-            <w:r>
-              <w:t>Yes</w:t>
-            </w:r>
-          </w:p>
-        </w:tc>
-        <w:tc>
-          <w:tcPr>
-            <w:tcW w:w="808" w:type="dxa"/>
+            <w:tcW w:w="792" w:type="dxa"/>
+          </w:tcPr>
+          <w:p>
+            <w:pPr>
+              <w:pStyle w:val="Compact"/>
+            </w:pPr>
+            <w:r>
+              <w:t>Ja</w:t>
+            </w:r>
+          </w:p>
+        </w:tc>
+        <w:tc>
+          <w:tcPr>
+            <w:tcW w:w="633" w:type="dxa"/>
+          </w:tcPr>
+          <w:p>
+            <w:pPr>
+              <w:pStyle w:val="Compact"/>
+            </w:pPr>
+            <w:r>
+              <w:t>Ja</w:t>
+            </w:r>
+          </w:p>
+        </w:tc>
+        <w:tc>
+          <w:tcPr>
+            <w:tcW w:w="792" w:type="dxa"/>
           </w:tcPr>
           <w:p>
             <w:pPr>
@@ -1179,7 +1180,7 @@
         </w:trPr>
         <w:tc>
           <w:tcPr>
-            <w:tcW w:w="969" w:type="dxa"/>
+            <w:tcW w:w="950" w:type="dxa"/>
           </w:tcPr>
           <w:p>
             <w:pPr>
@@ -1192,7 +1193,7 @@
         </w:tc>
         <w:tc>
           <w:tcPr>
-            <w:tcW w:w="4848" w:type="dxa"/>
+            <w:tcW w:w="4752" w:type="dxa"/>
           </w:tcPr>
           <w:p>
             <w:pPr>
@@ -1205,33 +1206,33 @@
         </w:tc>
         <w:tc>
           <w:tcPr>
-            <w:tcW w:w="646" w:type="dxa"/>
-          </w:tcPr>
-          <w:p>
-            <w:pPr>
-              <w:pStyle w:val="Compact"/>
-            </w:pPr>
-            <w:r>
-              <w:t>Yes</w:t>
-            </w:r>
-          </w:p>
-        </w:tc>
-        <w:tc>
-          <w:tcPr>
-            <w:tcW w:w="646" w:type="dxa"/>
-          </w:tcPr>
-          <w:p>
-            <w:pPr>
-              <w:pStyle w:val="Compact"/>
-            </w:pPr>
-            <w:r>
-              <w:t>Yes</w:t>
-            </w:r>
-          </w:p>
-        </w:tc>
-        <w:tc>
-          <w:tcPr>
-            <w:tcW w:w="808" w:type="dxa"/>
+            <w:tcW w:w="792" w:type="dxa"/>
+          </w:tcPr>
+          <w:p>
+            <w:pPr>
+              <w:pStyle w:val="Compact"/>
+            </w:pPr>
+            <w:r>
+              <w:t>Ja</w:t>
+            </w:r>
+          </w:p>
+        </w:tc>
+        <w:tc>
+          <w:tcPr>
+            <w:tcW w:w="633" w:type="dxa"/>
+          </w:tcPr>
+          <w:p>
+            <w:pPr>
+              <w:pStyle w:val="Compact"/>
+            </w:pPr>
+            <w:r>
+              <w:t>Ja</w:t>
+            </w:r>
+          </w:p>
+        </w:tc>
+        <w:tc>
+          <w:tcPr>
+            <w:tcW w:w="792" w:type="dxa"/>
           </w:tcPr>
           <w:p>
             <w:pPr>
@@ -1251,7 +1252,7 @@
       <w:tr>
         <w:tc>
           <w:tcPr>
-            <w:tcW w:w="969" w:type="dxa"/>
+            <w:tcW w:w="950" w:type="dxa"/>
           </w:tcPr>
           <w:p>
             <w:pPr>
@@ -1264,7 +1265,7 @@
         </w:tc>
         <w:tc>
           <w:tcPr>
-            <w:tcW w:w="4848" w:type="dxa"/>
+            <w:tcW w:w="4752" w:type="dxa"/>
           </w:tcPr>
           <w:p>
             <w:pPr>
@@ -1277,33 +1278,33 @@
         </w:tc>
         <w:tc>
           <w:tcPr>
-            <w:tcW w:w="646" w:type="dxa"/>
-          </w:tcPr>
-          <w:p>
-            <w:pPr>
-              <w:pStyle w:val="Compact"/>
-            </w:pPr>
-            <w:r>
-              <w:t>Yes</w:t>
-            </w:r>
-          </w:p>
-        </w:tc>
-        <w:tc>
-          <w:tcPr>
-            <w:tcW w:w="646" w:type="dxa"/>
-          </w:tcPr>
-          <w:p>
-            <w:pPr>
-              <w:pStyle w:val="Compact"/>
-            </w:pPr>
-            <w:r>
-              <w:t>Yes</w:t>
-            </w:r>
-          </w:p>
-        </w:tc>
-        <w:tc>
-          <w:tcPr>
-            <w:tcW w:w="808" w:type="dxa"/>
+            <w:tcW w:w="792" w:type="dxa"/>
+          </w:tcPr>
+          <w:p>
+            <w:pPr>
+              <w:pStyle w:val="Compact"/>
+            </w:pPr>
+            <w:r>
+              <w:t>Ja</w:t>
+            </w:r>
+          </w:p>
+        </w:tc>
+        <w:tc>
+          <w:tcPr>
+            <w:tcW w:w="633" w:type="dxa"/>
+          </w:tcPr>
+          <w:p>
+            <w:pPr>
+              <w:pStyle w:val="Compact"/>
+            </w:pPr>
+            <w:r>
+              <w:t>Ja</w:t>
+            </w:r>
+          </w:p>
+        </w:tc>
+        <w:tc>
+          <w:tcPr>
+            <w:tcW w:w="792" w:type="dxa"/>
           </w:tcPr>
           <w:p>
             <w:pPr>
@@ -1326,59 +1327,59 @@
         </w:trPr>
         <w:tc>
           <w:tcPr>
-            <w:tcW w:w="969" w:type="dxa"/>
-          </w:tcPr>
-          <w:p>
-            <w:pPr>
-              <w:pStyle w:val="Compact"/>
-            </w:pPr>
-            <w:r>
-              <w:t>10.13</w:t>
-            </w:r>
-          </w:p>
-        </w:tc>
-        <w:tc>
-          <w:tcPr>
-            <w:tcW w:w="4848" w:type="dxa"/>
-          </w:tcPr>
-          <w:p>
-            <w:pPr>
-              <w:pStyle w:val="Compact"/>
-            </w:pPr>
-            <w:r>
-              <w:t>Populationsgroessenschaetzung</w:t>
-            </w:r>
-          </w:p>
-        </w:tc>
-        <w:tc>
-          <w:tcPr>
-            <w:tcW w:w="646" w:type="dxa"/>
-          </w:tcPr>
-          <w:p>
-            <w:pPr>
-              <w:pStyle w:val="Compact"/>
-            </w:pPr>
-            <w:r>
-              <w:t>Yes</w:t>
-            </w:r>
-          </w:p>
-        </w:tc>
-        <w:tc>
-          <w:tcPr>
-            <w:tcW w:w="646" w:type="dxa"/>
-          </w:tcPr>
-          <w:p>
-            <w:pPr>
-              <w:pStyle w:val="Compact"/>
-            </w:pPr>
-            <w:r>
-              <w:t>Yes</w:t>
-            </w:r>
-          </w:p>
-        </w:tc>
-        <w:tc>
-          <w:tcPr>
-            <w:tcW w:w="808" w:type="dxa"/>
+            <w:tcW w:w="950" w:type="dxa"/>
+          </w:tcPr>
+          <w:p>
+            <w:pPr>
+              <w:pStyle w:val="Compact"/>
+            </w:pPr>
+            <w:r>
+              <w:t>10.10</w:t>
+            </w:r>
+          </w:p>
+        </w:tc>
+        <w:tc>
+          <w:tcPr>
+            <w:tcW w:w="4752" w:type="dxa"/>
+          </w:tcPr>
+          <w:p>
+            <w:pPr>
+              <w:pStyle w:val="Compact"/>
+            </w:pPr>
+            <w:r>
+              <w:t>Removal</w:t>
+            </w:r>
+          </w:p>
+        </w:tc>
+        <w:tc>
+          <w:tcPr>
+            <w:tcW w:w="792" w:type="dxa"/>
+          </w:tcPr>
+          <w:p>
+            <w:pPr>
+              <w:pStyle w:val="Compact"/>
+            </w:pPr>
+            <w:r>
+              <w:t>Nein</w:t>
+            </w:r>
+          </w:p>
+        </w:tc>
+        <w:tc>
+          <w:tcPr>
+            <w:tcW w:w="633" w:type="dxa"/>
+          </w:tcPr>
+          <w:p>
+            <w:pPr>
+              <w:pStyle w:val="Compact"/>
+            </w:pPr>
+            <w:r>
+              <w:t>Ja</w:t>
+            </w:r>
+          </w:p>
+        </w:tc>
+        <w:tc>
+          <w:tcPr>
+            <w:tcW w:w="792" w:type="dxa"/>
           </w:tcPr>
           <w:p>
             <w:pPr>
@@ -1398,59 +1399,59 @@
       <w:tr>
         <w:tc>
           <w:tcPr>
-            <w:tcW w:w="969" w:type="dxa"/>
-          </w:tcPr>
-          <w:p>
-            <w:pPr>
-              <w:pStyle w:val="Compact"/>
-            </w:pPr>
-            <w:r>
-              <w:t>10.5</w:t>
-            </w:r>
-          </w:p>
-        </w:tc>
-        <w:tc>
-          <w:tcPr>
-            <w:tcW w:w="4848" w:type="dxa"/>
-          </w:tcPr>
-          <w:p>
-            <w:pPr>
-              <w:pStyle w:val="Compact"/>
-            </w:pPr>
-            <w:r>
-              <w:t>Fangfrequenzen</w:t>
-            </w:r>
-          </w:p>
-        </w:tc>
-        <w:tc>
-          <w:tcPr>
-            <w:tcW w:w="646" w:type="dxa"/>
-          </w:tcPr>
-          <w:p>
-            <w:pPr>
-              <w:pStyle w:val="Compact"/>
-            </w:pPr>
-            <w:r>
-              <w:t>Yes</w:t>
-            </w:r>
-          </w:p>
-        </w:tc>
-        <w:tc>
-          <w:tcPr>
-            <w:tcW w:w="646" w:type="dxa"/>
-          </w:tcPr>
-          <w:p>
-            <w:pPr>
-              <w:pStyle w:val="Compact"/>
-            </w:pPr>
-            <w:r>
-              <w:t>Yes</w:t>
-            </w:r>
-          </w:p>
-        </w:tc>
-        <w:tc>
-          <w:tcPr>
-            <w:tcW w:w="808" w:type="dxa"/>
+            <w:tcW w:w="950" w:type="dxa"/>
+          </w:tcPr>
+          <w:p>
+            <w:pPr>
+              <w:pStyle w:val="Compact"/>
+            </w:pPr>
+            <w:r>
+              <w:t>10.11</w:t>
+            </w:r>
+          </w:p>
+        </w:tc>
+        <w:tc>
+          <w:tcPr>
+            <w:tcW w:w="4752" w:type="dxa"/>
+          </w:tcPr>
+          <w:p>
+            <w:pPr>
+              <w:pStyle w:val="Compact"/>
+            </w:pPr>
+            <w:r>
+              <w:t>Sample_Coverage</w:t>
+            </w:r>
+          </w:p>
+        </w:tc>
+        <w:tc>
+          <w:tcPr>
+            <w:tcW w:w="792" w:type="dxa"/>
+          </w:tcPr>
+          <w:p>
+            <w:pPr>
+              <w:pStyle w:val="Compact"/>
+            </w:pPr>
+            <w:r>
+              <w:t>Nein</w:t>
+            </w:r>
+          </w:p>
+        </w:tc>
+        <w:tc>
+          <w:tcPr>
+            <w:tcW w:w="633" w:type="dxa"/>
+          </w:tcPr>
+          <w:p>
+            <w:pPr>
+              <w:pStyle w:val="Compact"/>
+            </w:pPr>
+            <w:r>
+              <w:t>Ja</w:t>
+            </w:r>
+          </w:p>
+        </w:tc>
+        <w:tc>
+          <w:tcPr>
+            <w:tcW w:w="792" w:type="dxa"/>
           </w:tcPr>
           <w:p>
             <w:pPr>
@@ -1473,59 +1474,59 @@
         </w:trPr>
         <w:tc>
           <w:tcPr>
-            <w:tcW w:w="969" w:type="dxa"/>
-          </w:tcPr>
-          <w:p>
-            <w:pPr>
-              <w:pStyle w:val="Compact"/>
-            </w:pPr>
-            <w:r>
-              <w:t>11.11</w:t>
-            </w:r>
-          </w:p>
-        </w:tc>
-        <w:tc>
-          <w:tcPr>
-            <w:tcW w:w="4848" w:type="dxa"/>
-          </w:tcPr>
-          <w:p>
-            <w:pPr>
-              <w:pStyle w:val="Compact"/>
-            </w:pPr>
-            <w:r>
-              <w:t>Ringmeldungen</w:t>
-            </w:r>
-          </w:p>
-        </w:tc>
-        <w:tc>
-          <w:tcPr>
-            <w:tcW w:w="646" w:type="dxa"/>
-          </w:tcPr>
-          <w:p>
-            <w:pPr>
-              <w:pStyle w:val="Compact"/>
-            </w:pPr>
-            <w:r>
-              <w:t>Yes</w:t>
-            </w:r>
-          </w:p>
-        </w:tc>
-        <w:tc>
-          <w:tcPr>
-            <w:tcW w:w="646" w:type="dxa"/>
-          </w:tcPr>
-          <w:p>
-            <w:pPr>
-              <w:pStyle w:val="Compact"/>
-            </w:pPr>
-            <w:r>
-              <w:t>Yes</w:t>
-            </w:r>
-          </w:p>
-        </w:tc>
-        <w:tc>
-          <w:tcPr>
-            <w:tcW w:w="808" w:type="dxa"/>
+            <w:tcW w:w="950" w:type="dxa"/>
+          </w:tcPr>
+          <w:p>
+            <w:pPr>
+              <w:pStyle w:val="Compact"/>
+            </w:pPr>
+            <w:r>
+              <w:t>10.13</w:t>
+            </w:r>
+          </w:p>
+        </w:tc>
+        <w:tc>
+          <w:tcPr>
+            <w:tcW w:w="4752" w:type="dxa"/>
+          </w:tcPr>
+          <w:p>
+            <w:pPr>
+              <w:pStyle w:val="Compact"/>
+            </w:pPr>
+            <w:r>
+              <w:t>Populationsgroessenschaetzung</w:t>
+            </w:r>
+          </w:p>
+        </w:tc>
+        <w:tc>
+          <w:tcPr>
+            <w:tcW w:w="792" w:type="dxa"/>
+          </w:tcPr>
+          <w:p>
+            <w:pPr>
+              <w:pStyle w:val="Compact"/>
+            </w:pPr>
+            <w:r>
+              <w:t>Ja</w:t>
+            </w:r>
+          </w:p>
+        </w:tc>
+        <w:tc>
+          <w:tcPr>
+            <w:tcW w:w="633" w:type="dxa"/>
+          </w:tcPr>
+          <w:p>
+            <w:pPr>
+              <w:pStyle w:val="Compact"/>
+            </w:pPr>
+            <w:r>
+              <w:t>Ja</w:t>
+            </w:r>
+          </w:p>
+        </w:tc>
+        <w:tc>
+          <w:tcPr>
+            <w:tcW w:w="792" w:type="dxa"/>
           </w:tcPr>
           <w:p>
             <w:pPr>
@@ -1545,59 +1546,59 @@
       <w:tr>
         <w:tc>
           <w:tcPr>
-            <w:tcW w:w="969" w:type="dxa"/>
-          </w:tcPr>
-          <w:p>
-            <w:pPr>
-              <w:pStyle w:val="Compact"/>
-            </w:pPr>
-            <w:r>
-              <w:t>11.6</w:t>
-            </w:r>
-          </w:p>
-        </w:tc>
-        <w:tc>
-          <w:tcPr>
-            <w:tcW w:w="4848" w:type="dxa"/>
-          </w:tcPr>
-          <w:p>
-            <w:pPr>
-              <w:pStyle w:val="Compact"/>
-            </w:pPr>
-            <w:r>
-              <w:t>JS</w:t>
-            </w:r>
-          </w:p>
-        </w:tc>
-        <w:tc>
-          <w:tcPr>
-            <w:tcW w:w="646" w:type="dxa"/>
-          </w:tcPr>
-          <w:p>
-            <w:pPr>
-              <w:pStyle w:val="Compact"/>
-            </w:pPr>
-            <w:r>
-              <w:t>Yes</w:t>
-            </w:r>
-          </w:p>
-        </w:tc>
-        <w:tc>
-          <w:tcPr>
-            <w:tcW w:w="646" w:type="dxa"/>
-          </w:tcPr>
-          <w:p>
-            <w:pPr>
-              <w:pStyle w:val="Compact"/>
-            </w:pPr>
-            <w:r>
-              <w:t>Yes</w:t>
-            </w:r>
-          </w:p>
-        </w:tc>
-        <w:tc>
-          <w:tcPr>
-            <w:tcW w:w="808" w:type="dxa"/>
+            <w:tcW w:w="950" w:type="dxa"/>
+          </w:tcPr>
+          <w:p>
+            <w:pPr>
+              <w:pStyle w:val="Compact"/>
+            </w:pPr>
+            <w:r>
+              <w:t>10.5</w:t>
+            </w:r>
+          </w:p>
+        </w:tc>
+        <w:tc>
+          <w:tcPr>
+            <w:tcW w:w="4752" w:type="dxa"/>
+          </w:tcPr>
+          <w:p>
+            <w:pPr>
+              <w:pStyle w:val="Compact"/>
+            </w:pPr>
+            <w:r>
+              <w:t>Fangfrequenzen</w:t>
+            </w:r>
+          </w:p>
+        </w:tc>
+        <w:tc>
+          <w:tcPr>
+            <w:tcW w:w="792" w:type="dxa"/>
+          </w:tcPr>
+          <w:p>
+            <w:pPr>
+              <w:pStyle w:val="Compact"/>
+            </w:pPr>
+            <w:r>
+              <w:t>Ja</w:t>
+            </w:r>
+          </w:p>
+        </w:tc>
+        <w:tc>
+          <w:tcPr>
+            <w:tcW w:w="633" w:type="dxa"/>
+          </w:tcPr>
+          <w:p>
+            <w:pPr>
+              <w:pStyle w:val="Compact"/>
+            </w:pPr>
+            <w:r>
+              <w:t>Ja</w:t>
+            </w:r>
+          </w:p>
+        </w:tc>
+        <w:tc>
+          <w:tcPr>
+            <w:tcW w:w="792" w:type="dxa"/>
           </w:tcPr>
           <w:p>
             <w:pPr>
@@ -1608,13 +1609,229 @@
                 <w:rPr>
                   <w:rStyle w:val="Hyperlink"/>
                 </w:rPr>
-                <w:t>lin</w:t>
+                <w:t>link</w:t>
               </w:r>
+            </w:hyperlink>
+          </w:p>
+        </w:tc>
+      </w:tr>
+      <w:tr>
+        <w:trPr>
+          <w:cnfStyle w:val="000000100000" w:firstRow="0" w:lastRow="0" w:firstColumn="0" w:lastColumn="0" w:oddVBand="0" w:evenVBand="0" w:oddHBand="1" w:evenHBand="0" w:firstRowFirstColumn="0" w:firstRowLastColumn="0" w:lastRowFirstColumn="0" w:lastRowLastColumn="0"/>
+        </w:trPr>
+        <w:tc>
+          <w:tcPr>
+            <w:tcW w:w="950" w:type="dxa"/>
+          </w:tcPr>
+          <w:p>
+            <w:pPr>
+              <w:pStyle w:val="Compact"/>
+            </w:pPr>
+            <w:r>
+              <w:t>10.6</w:t>
+            </w:r>
+          </w:p>
+        </w:tc>
+        <w:tc>
+          <w:tcPr>
+            <w:tcW w:w="4752" w:type="dxa"/>
+          </w:tcPr>
+          <w:p>
+            <w:pPr>
+              <w:pStyle w:val="Compact"/>
+            </w:pPr>
+            <w:r>
+              <w:t>Gehyra_alle_Modelle</w:t>
+            </w:r>
+          </w:p>
+        </w:tc>
+        <w:tc>
+          <w:tcPr>
+            <w:tcW w:w="792" w:type="dxa"/>
+          </w:tcPr>
+          <w:p>
+            <w:pPr>
+              <w:pStyle w:val="Compact"/>
+            </w:pPr>
+            <w:r>
+              <w:t>Nein</w:t>
+            </w:r>
+          </w:p>
+        </w:tc>
+        <w:tc>
+          <w:tcPr>
+            <w:tcW w:w="633" w:type="dxa"/>
+          </w:tcPr>
+          <w:p>
+            <w:pPr>
+              <w:pStyle w:val="Compact"/>
+            </w:pPr>
+            <w:r>
+              <w:t>Ja</w:t>
+            </w:r>
+          </w:p>
+        </w:tc>
+        <w:tc>
+          <w:tcPr>
+            <w:tcW w:w="792" w:type="dxa"/>
+          </w:tcPr>
+          <w:p>
+            <w:pPr>
+              <w:pStyle w:val="Compact"/>
+            </w:pPr>
+            <w:hyperlink r:id="rId25">
               <w:r>
                 <w:rPr>
                   <w:rStyle w:val="Hyperlink"/>
                 </w:rPr>
-                <w:t>k</w:t>
+                <w:t>link</w:t>
+              </w:r>
+            </w:hyperlink>
+          </w:p>
+        </w:tc>
+      </w:tr>
+      <w:tr>
+        <w:tc>
+          <w:tcPr>
+            <w:tcW w:w="950" w:type="dxa"/>
+          </w:tcPr>
+          <w:p>
+            <w:pPr>
+              <w:pStyle w:val="Compact"/>
+            </w:pPr>
+            <w:r>
+              <w:t>11.11</w:t>
+            </w:r>
+          </w:p>
+        </w:tc>
+        <w:tc>
+          <w:tcPr>
+            <w:tcW w:w="4752" w:type="dxa"/>
+          </w:tcPr>
+          <w:p>
+            <w:pPr>
+              <w:pStyle w:val="Compact"/>
+            </w:pPr>
+            <w:r>
+              <w:t>Ringmeldungen</w:t>
+            </w:r>
+          </w:p>
+        </w:tc>
+        <w:tc>
+          <w:tcPr>
+            <w:tcW w:w="792" w:type="dxa"/>
+          </w:tcPr>
+          <w:p>
+            <w:pPr>
+              <w:pStyle w:val="Compact"/>
+            </w:pPr>
+            <w:r>
+              <w:t>Ja</w:t>
+            </w:r>
+          </w:p>
+        </w:tc>
+        <w:tc>
+          <w:tcPr>
+            <w:tcW w:w="633" w:type="dxa"/>
+          </w:tcPr>
+          <w:p>
+            <w:pPr>
+              <w:pStyle w:val="Compact"/>
+            </w:pPr>
+            <w:r>
+              <w:t>Ja</w:t>
+            </w:r>
+          </w:p>
+        </w:tc>
+        <w:tc>
+          <w:tcPr>
+            <w:tcW w:w="792" w:type="dxa"/>
+          </w:tcPr>
+          <w:p>
+            <w:pPr>
+              <w:pStyle w:val="Compact"/>
+            </w:pPr>
+            <w:hyperlink r:id="rId26">
+              <w:r>
+                <w:rPr>
+                  <w:rStyle w:val="Hyperlink"/>
+                </w:rPr>
+                <w:t>link</w:t>
+              </w:r>
+            </w:hyperlink>
+          </w:p>
+        </w:tc>
+      </w:tr>
+      <w:tr>
+        <w:trPr>
+          <w:cnfStyle w:val="000000100000" w:firstRow="0" w:lastRow="0" w:firstColumn="0" w:lastColumn="0" w:oddVBand="0" w:evenVBand="0" w:oddHBand="1" w:evenHBand="0" w:firstRowFirstColumn="0" w:firstRowLastColumn="0" w:lastRowFirstColumn="0" w:lastRowLastColumn="0"/>
+        </w:trPr>
+        <w:tc>
+          <w:tcPr>
+            <w:tcW w:w="950" w:type="dxa"/>
+          </w:tcPr>
+          <w:p>
+            <w:pPr>
+              <w:pStyle w:val="Compact"/>
+            </w:pPr>
+            <w:r>
+              <w:t>11.6</w:t>
+            </w:r>
+          </w:p>
+        </w:tc>
+        <w:tc>
+          <w:tcPr>
+            <w:tcW w:w="4752" w:type="dxa"/>
+          </w:tcPr>
+          <w:p>
+            <w:pPr>
+              <w:pStyle w:val="Compact"/>
+            </w:pPr>
+            <w:r>
+              <w:t>JS</w:t>
+            </w:r>
+          </w:p>
+        </w:tc>
+        <w:tc>
+          <w:tcPr>
+            <w:tcW w:w="792" w:type="dxa"/>
+          </w:tcPr>
+          <w:p>
+            <w:pPr>
+              <w:pStyle w:val="Compact"/>
+            </w:pPr>
+            <w:r>
+              <w:t>Ja</w:t>
+            </w:r>
+          </w:p>
+        </w:tc>
+        <w:tc>
+          <w:tcPr>
+            <w:tcW w:w="633" w:type="dxa"/>
+          </w:tcPr>
+          <w:p>
+            <w:pPr>
+              <w:pStyle w:val="Compact"/>
+            </w:pPr>
+            <w:r>
+              <w:t>Ja</w:t>
+            </w:r>
+          </w:p>
+        </w:tc>
+        <w:tc>
+          <w:tcPr>
+            <w:tcW w:w="792" w:type="dxa"/>
+          </w:tcPr>
+          <w:p>
+            <w:pPr>
+              <w:pStyle w:val="Compact"/>
+            </w:pPr>
+            <w:hyperlink r:id="rId27">
+              <w:r>
+                <w:rPr>
+                  <w:rStyle w:val="Hyperlink"/>
+                </w:rPr>
+                <w:t>link</w:t>
               </w:r>
             </w:hyperlink>
           </w:p>
@@ -1637,7 +1854,7 @@
   <w:abstractNum w:abstractNumId="0" w15:restartNumberingAfterBreak="0">
     <w:nsid w:val="0000A990"/>
     <w:multiLevelType w:val="multilevel"/>
-    <w:tmpl w:val="D286DD70"/>
+    <w:tmpl w:val="900483B6"/>
     <w:lvl w:ilvl="0">
       <w:numFmt w:val="bullet"/>
       <w:lvlText w:val=" "/>
@@ -1711,7 +1928,7 @@
       </w:pPr>
     </w:lvl>
   </w:abstractNum>
-  <w:num w:numId="1" w16cid:durableId="1388257993">
+  <w:num w:numId="1" w16cid:durableId="781340782">
     <w:abstractNumId w:val="0"/>
   </w:num>
 </w:numbering>
@@ -2960,112 +3177,11 @@
       <w:shd w:val="clear" w:color="auto" w:fill="F8F8F8"/>
     </w:rPr>
   </w:style>
-  <w:style w:type="character" w:styleId="FollowedHyperlink">
-    <w:name w:val="FollowedHyperlink"/>
-    <w:basedOn w:val="DefaultParagraphFont"/>
-    <w:rsid w:val="00D57609"/>
-    <w:rPr>
-      <w:color w:val="96607D" w:themeColor="followedHyperlink"/>
-      <w:u w:val="single"/>
-    </w:rPr>
-  </w:style>
-  <w:style w:type="table" w:styleId="PlainTable3">
-    <w:name w:val="Plain Table 3"/>
+  <w:style w:type="table" w:styleId="GridTable4-Accent1">
+    <w:name w:val="Grid Table 4 Accent 1"/>
     <w:basedOn w:val="TableNormal"/>
-    <w:rsid w:val="00D57609"/>
-    <w:pPr>
-      <w:spacing w:after="0"/>
-    </w:pPr>
-    <w:tblPr>
-      <w:tblStyleRowBandSize w:val="1"/>
-      <w:tblStyleColBandSize w:val="1"/>
-    </w:tblPr>
-    <w:tblStylePr w:type="firstRow">
-      <w:rPr>
-        <w:b/>
-        <w:bCs/>
-        <w:caps/>
-      </w:rPr>
-      <w:tblPr/>
-      <w:tcPr>
-        <w:tcBorders>
-          <w:bottom w:val="single" w:sz="4" w:space="0" w:color="7F7F7F" w:themeColor="text1" w:themeTint="80"/>
-        </w:tcBorders>
-      </w:tcPr>
-    </w:tblStylePr>
-    <w:tblStylePr w:type="lastRow">
-      <w:rPr>
-        <w:b/>
-        <w:bCs/>
-        <w:caps/>
-      </w:rPr>
-      <w:tblPr/>
-      <w:tcPr>
-        <w:tcBorders>
-          <w:top w:val="nil"/>
-        </w:tcBorders>
-      </w:tcPr>
-    </w:tblStylePr>
-    <w:tblStylePr w:type="firstCol">
-      <w:rPr>
-        <w:b/>
-        <w:bCs/>
-        <w:caps/>
-      </w:rPr>
-      <w:tblPr/>
-      <w:tcPr>
-        <w:tcBorders>
-          <w:right w:val="single" w:sz="4" w:space="0" w:color="7F7F7F" w:themeColor="text1" w:themeTint="80"/>
-        </w:tcBorders>
-      </w:tcPr>
-    </w:tblStylePr>
-    <w:tblStylePr w:type="lastCol">
-      <w:rPr>
-        <w:b/>
-        <w:bCs/>
-        <w:caps/>
-      </w:rPr>
-      <w:tblPr/>
-      <w:tcPr>
-        <w:tcBorders>
-          <w:left w:val="nil"/>
-        </w:tcBorders>
-      </w:tcPr>
-    </w:tblStylePr>
-    <w:tblStylePr w:type="band1Vert">
-      <w:tblPr/>
-      <w:tcPr>
-        <w:shd w:val="clear" w:color="auto" w:fill="F2F2F2" w:themeFill="background1" w:themeFillShade="F2"/>
-      </w:tcPr>
-    </w:tblStylePr>
-    <w:tblStylePr w:type="band1Horz">
-      <w:tblPr/>
-      <w:tcPr>
-        <w:shd w:val="clear" w:color="auto" w:fill="F2F2F2" w:themeFill="background1" w:themeFillShade="F2"/>
-      </w:tcPr>
-    </w:tblStylePr>
-    <w:tblStylePr w:type="neCell">
-      <w:tblPr/>
-      <w:tcPr>
-        <w:tcBorders>
-          <w:left w:val="nil"/>
-        </w:tcBorders>
-      </w:tcPr>
-    </w:tblStylePr>
-    <w:tblStylePr w:type="nwCell">
-      <w:tblPr/>
-      <w:tcPr>
-        <w:tcBorders>
-          <w:right w:val="nil"/>
-        </w:tcBorders>
-      </w:tcPr>
-    </w:tblStylePr>
-  </w:style>
-  <w:style w:type="table" w:styleId="GridTable3-Accent4">
-    <w:name w:val="Grid Table 3 Accent 4"/>
-    <w:basedOn w:val="TableNormal"/>
-    <w:uiPriority w:val="48"/>
-    <w:rsid w:val="00D57609"/>
+    <w:uiPriority w:val="49"/>
+    <w:rsid w:val="00B91C7C"/>
     <w:pPr>
       <w:spacing w:after="0"/>
     </w:pPr>
@@ -3073,29 +3189,31 @@
       <w:tblStyleRowBandSize w:val="1"/>
       <w:tblStyleColBandSize w:val="1"/>
       <w:tblBorders>
-        <w:top w:val="single" w:sz="4" w:space="0" w:color="60CAF3" w:themeColor="accent4" w:themeTint="99"/>
-        <w:left w:val="single" w:sz="4" w:space="0" w:color="60CAF3" w:themeColor="accent4" w:themeTint="99"/>
-        <w:bottom w:val="single" w:sz="4" w:space="0" w:color="60CAF3" w:themeColor="accent4" w:themeTint="99"/>
-        <w:right w:val="single" w:sz="4" w:space="0" w:color="60CAF3" w:themeColor="accent4" w:themeTint="99"/>
-        <w:insideH w:val="single" w:sz="4" w:space="0" w:color="60CAF3" w:themeColor="accent4" w:themeTint="99"/>
-        <w:insideV w:val="single" w:sz="4" w:space="0" w:color="60CAF3" w:themeColor="accent4" w:themeTint="99"/>
+        <w:top w:val="single" w:sz="4" w:space="0" w:color="45B0E1" w:themeColor="accent1" w:themeTint="99"/>
+        <w:left w:val="single" w:sz="4" w:space="0" w:color="45B0E1" w:themeColor="accent1" w:themeTint="99"/>
+        <w:bottom w:val="single" w:sz="4" w:space="0" w:color="45B0E1" w:themeColor="accent1" w:themeTint="99"/>
+        <w:right w:val="single" w:sz="4" w:space="0" w:color="45B0E1" w:themeColor="accent1" w:themeTint="99"/>
+        <w:insideH w:val="single" w:sz="4" w:space="0" w:color="45B0E1" w:themeColor="accent1" w:themeTint="99"/>
+        <w:insideV w:val="single" w:sz="4" w:space="0" w:color="45B0E1" w:themeColor="accent1" w:themeTint="99"/>
       </w:tblBorders>
     </w:tblPr>
     <w:tblStylePr w:type="firstRow">
       <w:rPr>
         <w:b/>
         <w:bCs/>
+        <w:color w:val="FFFFFF" w:themeColor="background1"/>
       </w:rPr>
       <w:tblPr/>
       <w:tcPr>
         <w:tcBorders>
-          <w:top w:val="nil"/>
-          <w:left w:val="nil"/>
-          <w:right w:val="nil"/>
+          <w:top w:val="single" w:sz="4" w:space="0" w:color="156082" w:themeColor="accent1"/>
+          <w:left w:val="single" w:sz="4" w:space="0" w:color="156082" w:themeColor="accent1"/>
+          <w:bottom w:val="single" w:sz="4" w:space="0" w:color="156082" w:themeColor="accent1"/>
+          <w:right w:val="single" w:sz="4" w:space="0" w:color="156082" w:themeColor="accent1"/>
           <w:insideH w:val="nil"/>
           <w:insideV w:val="nil"/>
         </w:tcBorders>
-        <w:shd w:val="clear" w:color="auto" w:fill="FFFFFF" w:themeFill="background1"/>
+        <w:shd w:val="clear" w:color="auto" w:fill="156082" w:themeFill="accent1"/>
       </w:tcPr>
     </w:tblStylePr>
     <w:tblStylePr w:type="lastRow">
@@ -3106,94 +3224,32 @@
       <w:tblPr/>
       <w:tcPr>
         <w:tcBorders>
-          <w:left w:val="nil"/>
-          <w:bottom w:val="nil"/>
-          <w:right w:val="nil"/>
-          <w:insideH w:val="nil"/>
-          <w:insideV w:val="nil"/>
+          <w:top w:val="double" w:sz="4" w:space="0" w:color="156082" w:themeColor="accent1"/>
         </w:tcBorders>
-        <w:shd w:val="clear" w:color="auto" w:fill="FFFFFF" w:themeFill="background1"/>
       </w:tcPr>
     </w:tblStylePr>
     <w:tblStylePr w:type="firstCol">
-      <w:pPr>
-        <w:jc w:val="right"/>
-      </w:pPr>
       <w:rPr>
-        <w:i/>
-        <w:iCs/>
+        <w:b/>
+        <w:bCs/>
       </w:rPr>
-      <w:tblPr/>
-      <w:tcPr>
-        <w:tcBorders>
-          <w:top w:val="nil"/>
-          <w:left w:val="nil"/>
-          <w:bottom w:val="nil"/>
-          <w:insideH w:val="nil"/>
-          <w:insideV w:val="nil"/>
-        </w:tcBorders>
-        <w:shd w:val="clear" w:color="auto" w:fill="FFFFFF" w:themeFill="background1"/>
-      </w:tcPr>
     </w:tblStylePr>
     <w:tblStylePr w:type="lastCol">
       <w:rPr>
-        <w:i/>
-        <w:iCs/>
+        <w:b/>
+        <w:bCs/>
       </w:rPr>
-      <w:tblPr/>
-      <w:tcPr>
-        <w:tcBorders>
-          <w:top w:val="nil"/>
-          <w:bottom w:val="nil"/>
-          <w:right w:val="nil"/>
-          <w:insideH w:val="nil"/>
-          <w:insideV w:val="nil"/>
-        </w:tcBorders>
-        <w:shd w:val="clear" w:color="auto" w:fill="FFFFFF" w:themeFill="background1"/>
-      </w:tcPr>
     </w:tblStylePr>
     <w:tblStylePr w:type="band1Vert">
       <w:tblPr/>
       <w:tcPr>
-        <w:shd w:val="clear" w:color="auto" w:fill="CAEDFB" w:themeFill="accent4" w:themeFillTint="33"/>
+        <w:shd w:val="clear" w:color="auto" w:fill="C1E4F5" w:themeFill="accent1" w:themeFillTint="33"/>
       </w:tcPr>
     </w:tblStylePr>
     <w:tblStylePr w:type="band1Horz">
       <w:tblPr/>
       <w:tcPr>
-        <w:shd w:val="clear" w:color="auto" w:fill="CAEDFB" w:themeFill="accent4" w:themeFillTint="33"/>
-      </w:tcPr>
-    </w:tblStylePr>
-    <w:tblStylePr w:type="neCell">
-      <w:tblPr/>
-      <w:tcPr>
-        <w:tcBorders>
-          <w:bottom w:val="single" w:sz="4" w:space="0" w:color="60CAF3" w:themeColor="accent4" w:themeTint="99"/>
-        </w:tcBorders>
-      </w:tcPr>
-    </w:tblStylePr>
-    <w:tblStylePr w:type="nwCell">
-      <w:tblPr/>
-      <w:tcPr>
-        <w:tcBorders>
-          <w:bottom w:val="single" w:sz="4" w:space="0" w:color="60CAF3" w:themeColor="accent4" w:themeTint="99"/>
-        </w:tcBorders>
-      </w:tcPr>
-    </w:tblStylePr>
-    <w:tblStylePr w:type="seCell">
-      <w:tblPr/>
-      <w:tcPr>
-        <w:tcBorders>
-          <w:top w:val="single" w:sz="4" w:space="0" w:color="60CAF3" w:themeColor="accent4" w:themeTint="99"/>
-        </w:tcBorders>
-      </w:tcPr>
-    </w:tblStylePr>
-    <w:tblStylePr w:type="swCell">
-      <w:tblPr/>
-      <w:tcPr>
-        <w:tcBorders>
-          <w:top w:val="single" w:sz="4" w:space="0" w:color="60CAF3" w:themeColor="accent4" w:themeTint="99"/>
-        </w:tcBorders>
+        <w:shd w:val="clear" w:color="auto" w:fill="C1E4F5" w:themeFill="accent1" w:themeFillTint="33"/>
       </w:tcPr>
     </w:tblStylePr>
   </w:style>

</xml_diff>